<commit_message>
update load and start to learn OS
</commit_message>
<xml_diff>
--- a/stm32mp157_linux/Linux系统学习笔记.docx
+++ b/stm32mp157_linux/Linux系统学习笔记.docx
@@ -37,6 +37,31 @@
     <w:p>
       <w:pPr>
         <w:rPr>
+          <w:rFonts w:hint="eastAsia"/>
+          <w:lang w:val="en-US" w:eastAsia="zh-CN"/>
+        </w:rPr>
+      </w:pPr>
+      <w:r>
+        <w:rPr>
+          <w:rFonts w:hint="eastAsia"/>
+          <w:lang w:val="en-US" w:eastAsia="zh-CN"/>
+        </w:rPr>
+        <w:t>待补充，未完成</w:t>
+      </w:r>
+    </w:p>
+    <w:p>
+      <w:pPr>
+        <w:rPr>
+          <w:rFonts w:hint="eastAsia"/>
+          <w:lang w:val="en-US" w:eastAsia="zh-CN"/>
+        </w:rPr>
+      </w:pPr>
+    </w:p>
+    <w:p>
+      <w:pPr>
+        <w:pStyle w:val="2"/>
+        <w:bidi w:val="0"/>
+        <w:rPr>
           <w:rFonts w:hint="default"/>
           <w:lang w:val="en-US" w:eastAsia="zh-CN"/>
         </w:rPr>
@@ -46,10 +71,103 @@
           <w:rFonts w:hint="eastAsia"/>
           <w:lang w:val="en-US" w:eastAsia="zh-CN"/>
         </w:rPr>
-        <w:t>待补充，未完成</w:t>
+        <w:t>ctrl + c\d\z</w:t>
+      </w:r>
+    </w:p>
+    <w:p>
+      <w:pPr>
+        <w:rPr>
+          <w:rFonts w:hint="eastAsia"/>
+          <w:lang w:val="en-US" w:eastAsia="zh-CN"/>
+        </w:rPr>
+      </w:pPr>
+      <w:r>
+        <w:rPr>
+          <w:rFonts w:hint="eastAsia"/>
+          <w:lang w:val="en-US" w:eastAsia="zh-CN"/>
+        </w:rPr>
+        <w:tab/>
+        <w:t>ctrl +c/z 在Linux中是释放信号，而ctrl + d则是一个二进制值：EOF，通常表示exit的意思，比如退出程序exit就用ctrl + d..而ctrl + c表示强制中断程序执行，进程已经终止。ctrl + Z表示进程终止（暂停），使用fg和bg前者是重新唤起在终端运行，后者bg则是重新启动但在后台运行。</w:t>
+      </w:r>
+    </w:p>
+    <w:p>
+      <w:pPr>
+        <w:rPr>
+          <w:rFonts w:hint="eastAsia"/>
+          <w:lang w:val="en-US" w:eastAsia="zh-CN"/>
+        </w:rPr>
+      </w:pPr>
+      <w:r>
+        <w:rPr>
+          <w:rFonts w:hint="eastAsia"/>
+          <w:lang w:val="en-US" w:eastAsia="zh-CN"/>
+        </w:rPr>
+        <w:t>1、ctrl +c :进程中断强制结束信号</w:t>
+      </w:r>
+    </w:p>
+    <w:p>
+      <w:pPr>
+        <w:rPr>
+          <w:rFonts w:hint="eastAsia"/>
+          <w:lang w:val="en-US" w:eastAsia="zh-CN"/>
+        </w:rPr>
+      </w:pPr>
+      <w:r>
+        <w:rPr>
+          <w:rFonts w:hint="eastAsia"/>
+          <w:lang w:val="en-US" w:eastAsia="zh-CN"/>
+        </w:rPr>
+        <w:t>2、ctrl =z:进程暂停信号</w:t>
+      </w:r>
+    </w:p>
+    <w:p>
+      <w:pPr>
+        <w:rPr>
+          <w:rFonts w:hint="eastAsia"/>
+          <w:lang w:val="en-US" w:eastAsia="zh-CN"/>
+        </w:rPr>
+      </w:pPr>
+      <w:r>
+        <w:rPr>
+          <w:rFonts w:hint="eastAsia"/>
+          <w:lang w:val="en-US" w:eastAsia="zh-CN"/>
+        </w:rPr>
+        <w:t>3、ctrl +d:进程退出信号</w:t>
+      </w:r>
+    </w:p>
+    <w:p>
+      <w:pPr>
+        <w:rPr>
+          <w:rFonts w:hint="default"/>
+          <w:lang w:val="en-US" w:eastAsia="zh-CN"/>
+        </w:rPr>
+      </w:pPr>
+      <w:r>
+        <w:rPr>
+          <w:rFonts w:hint="eastAsia"/>
+          <w:lang w:val="en-US" w:eastAsia="zh-CN"/>
+        </w:rPr>
+        <w:tab/>
+        <w:t>三个信号都可以被进程选择性的接受，比如gdb退出使用的就是ctrl + d，ctrl + c信号在gdb应该是用作强制退出调试程序。信号的响应对于进程而言是可设置的。</w:t>
       </w:r>
       <w:bookmarkStart w:id="0" w:name="_GoBack"/>
       <w:bookmarkEnd w:id="0"/>
+    </w:p>
+    <w:p>
+      <w:pPr>
+        <w:rPr>
+          <w:rFonts w:hint="default"/>
+          <w:lang w:val="en-US" w:eastAsia="zh-CN"/>
+        </w:rPr>
+      </w:pPr>
+    </w:p>
+    <w:p>
+      <w:pPr>
+        <w:rPr>
+          <w:rFonts w:hint="default"/>
+          <w:lang w:val="en-US" w:eastAsia="zh-CN"/>
+        </w:rPr>
+      </w:pPr>
     </w:p>
     <w:sectPr>
       <w:pgSz w:w="11906" w:h="16838"/>

</xml_diff>